<commit_message>
This is a test
</commit_message>
<xml_diff>
--- a/Chapter 024 - Roof.docx
+++ b/Chapter 024 - Roof.docx
@@ -43,7 +43,19 @@
     </w:p>
     <w:p>
       <w:r>
-        <w:t xml:space="preserve">“It’s an important role. Keeping Andrew safe. I mean someone </w:t>
+        <w:t>“</w:t>
+      </w:r>
+      <w:r>
+        <w:t>I mean that’s</w:t>
+      </w:r>
+      <w:r>
+        <w:t xml:space="preserve"> an important role. Keeping Andrew safe. </w:t>
+      </w:r>
+      <w:r>
+        <w:t>S</w:t>
+      </w:r>
+      <w:r>
+        <w:t xml:space="preserve">omeone </w:t>
       </w:r>
       <w:proofErr w:type="gramStart"/>
       <w:r>
@@ -54,7 +66,13 @@
         <w:t xml:space="preserve"> do it</w:t>
       </w:r>
       <w:r>
-        <w:t>, but not a lot of detection involved</w:t>
+        <w:t>. B</w:t>
+      </w:r>
+      <w:r>
+        <w:t>ut not a lot of detection involved</w:t>
+      </w:r>
+      <w:r>
+        <w:t xml:space="preserve"> is there</w:t>
       </w:r>
       <w:r>
         <w:t>. Or murder, you never did a murder did you.”</w:t>
@@ -75,7 +93,17 @@
       </w:r>
       <w:r>
         <w:br/>
-        <w:t xml:space="preserve">“Exactly. We don’t want to do that. We’re too busy with our other – </w:t>
+        <w:t xml:space="preserve">“Exactly. </w:t>
+      </w:r>
+      <w:r>
+        <w:rPr>
+          <w:i/>
+          <w:iCs/>
+        </w:rPr>
+        <w:t>We</w:t>
+      </w:r>
+      <w:r>
+        <w:t xml:space="preserve"> don’t want to do that. We’re too busy with our other – </w:t>
       </w:r>
       <w:proofErr w:type="spellStart"/>
       <w:r>
@@ -83,11 +111,16 @@
       </w:r>
       <w:proofErr w:type="spellEnd"/>
       <w:r>
-        <w:t>.  But we need some people around who do</w:t>
+        <w:t xml:space="preserve">.  But we need some people around who </w:t>
+      </w:r>
+      <w:proofErr w:type="gramStart"/>
+      <w:r>
+        <w:t>do</w:t>
       </w:r>
       <w:r>
         <w:t>es</w:t>
       </w:r>
+      <w:proofErr w:type="gramEnd"/>
       <w:r>
         <w:t xml:space="preserve"> want </w:t>
       </w:r>
@@ -97,7 +130,13 @@
       </w:r>
       <w:proofErr w:type="gramEnd"/>
       <w:r>
-        <w:t xml:space="preserve"> that. And people ask </w:t>
+        <w:t xml:space="preserve"> that</w:t>
+      </w:r>
+      <w:r>
+        <w:t>, well at least someone who’s willing to do it.</w:t>
+      </w:r>
+      <w:r>
+        <w:t xml:space="preserve"> And people ask </w:t>
       </w:r>
       <w:r>
         <w:t>less</w:t>
@@ -123,18 +162,34 @@
     </w:p>
     <w:p>
       <w:r>
-        <w:t xml:space="preserve">“Ah, yes, I forgot, lots of time to do the crossword in Royal protection.” </w:t>
-      </w:r>
-    </w:p>
-    <w:p>
-      <w:r>
-        <w:t xml:space="preserve">“But like I said, he doesn’t do anything. Last time I was in that </w:t>
-      </w:r>
-      <w:proofErr w:type="gramStart"/>
-      <w:r>
-        <w:t>office</w:t>
-      </w:r>
-      <w:proofErr w:type="gramEnd"/>
+        <w:t>“Ah, yes, I forgot</w:t>
+      </w:r>
+      <w:r>
+        <w:t>.</w:t>
+      </w:r>
+      <w:r>
+        <w:t xml:space="preserve"> </w:t>
+      </w:r>
+      <w:r>
+        <w:t>L</w:t>
+      </w:r>
+      <w:r>
+        <w:t xml:space="preserve">ots of time to do the crossword in Royal protection.” </w:t>
+      </w:r>
+    </w:p>
+    <w:p>
+      <w:r>
+        <w:t>“</w:t>
+      </w:r>
+      <w:r>
+        <w:t>And what do you mean solve crime? H</w:t>
+      </w:r>
+      <w:r>
+        <w:t>e doesn’t do anything. Last time I was in that office</w:t>
+      </w:r>
+      <w:r>
+        <w:t>,</w:t>
+      </w:r>
       <w:r>
         <w:t xml:space="preserve"> and I wanted to see him they said he’d gone for a walk. A fucking walk!”</w:t>
       </w:r>
@@ -209,7 +264,44 @@
     </w:p>
     <w:p>
       <w:r>
-        <w:t>An alarm would sound on his phone if there was movement in the chapel or the library. And it wasn’t just one system. It was multiple systems. Preston assured him. Yes, someone *could* disable it. But they would have to be mission-impossible level good to disable the whole thing all at once.</w:t>
+        <w:t xml:space="preserve">An alarm would sound on his phone if there was movement in the chapel or the library. And it wasn’t just one system. It was multiple systems. Preston assured him. </w:t>
+      </w:r>
+    </w:p>
+    <w:p>
+      <w:r>
+        <w:t xml:space="preserve">“Could they disable? If they </w:t>
+      </w:r>
+      <w:proofErr w:type="gramStart"/>
+      <w:r>
+        <w:t>was</w:t>
+      </w:r>
+      <w:proofErr w:type="gramEnd"/>
+      <w:r>
+        <w:t xml:space="preserve"> as good as me, yes, they could disable it. We only tell the punters that an alarm system is burglar proof </w:t>
+      </w:r>
+      <w:proofErr w:type="spellStart"/>
+      <w:r>
+        <w:t>innit</w:t>
+      </w:r>
+      <w:proofErr w:type="spellEnd"/>
+      <w:r>
+        <w:t>?”</w:t>
+      </w:r>
+    </w:p>
+    <w:p>
+      <w:r>
+        <w:t xml:space="preserve">Preston cast an eye over the kit that he’d been installing. </w:t>
+      </w:r>
+    </w:p>
+    <w:p>
+      <w:r>
+        <w:t>“</w:t>
+      </w:r>
+      <w:r>
+        <w:t>Yes, someone *could* disable it. But they would have to be mission-impossible level good to disable the whole thing all at once.</w:t>
+      </w:r>
+      <w:r>
+        <w:t>”</w:t>
       </w:r>
     </w:p>
     <w:p>
@@ -219,7 +311,16 @@
         </w:pBdr>
       </w:pPr>
       <w:r>
-        <w:t xml:space="preserve">So that morning Klee did what he’d been wanting to do for several days. He woke up, washed his face and walked straight out the door. Eventually, he was going to sit and drink a coffee, but before he got </w:t>
+        <w:t xml:space="preserve">That was enough of a guarantee for Klee. </w:t>
+      </w:r>
+      <w:r>
+        <w:t>So that morning</w:t>
+      </w:r>
+      <w:r>
+        <w:t xml:space="preserve"> he</w:t>
+      </w:r>
+      <w:r>
+        <w:t xml:space="preserve"> did what he’d been wanting to do for several days. He woke up, washed his face and walked straight out the door. Eventually, he was going to sit and drink a coffee, but before he got </w:t>
       </w:r>
       <w:proofErr w:type="gramStart"/>
       <w:r>
@@ -233,7 +334,7 @@
         <w:t>a</w:t>
       </w:r>
       <w:r>
-        <w:t>nder around. He’d vaguely realized now he could walk to the café – the café, the one he’d found on the first day via the suburban streets and then along the high street that had a row of shops. Or he could walk</w:t>
+        <w:t>nder around. He’d vaguely realized now he could walk to the café via the suburban streets and then along the high street. Or he could walk</w:t>
       </w:r>
       <w:r>
         <w:t xml:space="preserve"> another </w:t>
@@ -245,7 +346,21 @@
         <w:t>, around the back</w:t>
       </w:r>
       <w:r>
-        <w:t xml:space="preserve">. Down a series of short-cut alleys and out into the park. The park was a surprise. It was huge. And that time in the morning it looked crisp and clean. Of course he wasn’t alone. There were joggers, there were dog walkers. </w:t>
+        <w:t xml:space="preserve">. Down a series of short-cut alleys and out into the park. The park was a surprise. It was huge. </w:t>
+      </w:r>
+      <w:r>
+        <w:t xml:space="preserve">And green and quiet. At </w:t>
+      </w:r>
+      <w:r>
+        <w:t xml:space="preserve">that time in the </w:t>
+      </w:r>
+      <w:proofErr w:type="gramStart"/>
+      <w:r>
+        <w:t>morning</w:t>
+      </w:r>
+      <w:proofErr w:type="gramEnd"/>
+      <w:r>
+        <w:t xml:space="preserve"> it looked crisp and clean. Of course he wasn’t alone. There were joggers, there were dog walkers. </w:t>
       </w:r>
     </w:p>
     <w:p>
@@ -320,9 +435,13 @@
       <w:r>
         <w:t xml:space="preserve"> Klee.”</w:t>
       </w:r>
-    </w:p>
-    <w:p>
-      <w:r>
+      <w:r>
+        <w:t xml:space="preserve"> He was a round man, not much taller than Klee, with balding white hair. He was in a suit, but it didn’t seem to fit him that well? Was it a charity shop purchase? Or had Trevor Johnson lost weight? </w:t>
+      </w:r>
+    </w:p>
+    <w:p>
+      <w:r>
+        <w:lastRenderedPageBreak/>
         <w:t xml:space="preserve">“I’m currently working as a live-in security guard at the former Unitarian Chapel – the one on </w:t>
       </w:r>
       <w:proofErr w:type="gramStart"/>
@@ -354,8 +473,195 @@
     </w:p>
     <w:p>
       <w:r>
+        <w:t>“He promised he was going to repair the roof, that was part of the deal with the council – that’s the only reason they allowed him to turn it into a private residence.</w:t>
+      </w:r>
+      <w:r>
+        <w:t xml:space="preserve"> And of course, although it wasn’t any of our business, technically </w:t>
+      </w:r>
+      <w:proofErr w:type="gramStart"/>
+      <w:r>
+        <w:t>any more</w:t>
+      </w:r>
+      <w:proofErr w:type="gramEnd"/>
+      <w:r>
+        <w:t xml:space="preserve"> after we’d sold it, well, I certainly would love to hear that someone did repair the roof.</w:t>
+      </w:r>
+      <w:r>
+        <w:t>”</w:t>
+      </w:r>
+    </w:p>
+    <w:p>
+      <w:r>
+        <w:t>“</w:t>
+      </w:r>
+      <w:r>
+        <w:t>Who was this?”</w:t>
+      </w:r>
+      <w:r>
+        <w:br/>
+        <w:t>“</w:t>
+      </w:r>
+      <w:r>
+        <w:t xml:space="preserve">His name was… </w:t>
+      </w:r>
+      <w:proofErr w:type="spellStart"/>
+      <w:r>
+        <w:t>Mr</w:t>
+      </w:r>
+      <w:proofErr w:type="spellEnd"/>
+      <w:r>
+        <w:t xml:space="preserve"> – I’m sorry </w:t>
+      </w:r>
+      <w:proofErr w:type="spellStart"/>
+      <w:r>
+        <w:t>Mr</w:t>
+      </w:r>
+      <w:proofErr w:type="spellEnd"/>
+      <w:r>
+        <w:t xml:space="preserve"> Klee, it has been over thirty years. It was something French. </w:t>
+      </w:r>
+      <w:proofErr w:type="spellStart"/>
+      <w:r>
+        <w:t>D’Aubilles</w:t>
+      </w:r>
+      <w:proofErr w:type="spellEnd"/>
+      <w:r>
+        <w:t xml:space="preserve"> that was it. The pastor pronounced all the letters in the name, even though he’d said it was French, so it sounded like “D</w:t>
+      </w:r>
+      <w:r>
+        <w:t>ough Beels</w:t>
+      </w:r>
+      <w:r>
+        <w:t xml:space="preserve">”. </w:t>
+      </w:r>
+    </w:p>
+    <w:p>
+      <w:r>
+        <w:t xml:space="preserve">“Did you even meet </w:t>
+      </w:r>
+      <w:proofErr w:type="spellStart"/>
+      <w:r>
+        <w:t>Mr</w:t>
+      </w:r>
+      <w:proofErr w:type="spellEnd"/>
+      <w:r>
+        <w:t xml:space="preserve"> D’Aubilles.” Klee realized that it sounded like he was being a dick pronouncing it “Dough Bee.” But also realized he </w:t>
+      </w:r>
+      <w:proofErr w:type="gramStart"/>
+      <w:r>
+        <w:t>need</w:t>
+      </w:r>
+      <w:proofErr w:type="gramEnd"/>
+      <w:r>
+        <w:t xml:space="preserve"> to lean on that pronunciation to see if it registered at all with Johnson. Say it. Dobby. </w:t>
+      </w:r>
+    </w:p>
+    <w:p>
+      <w:r>
+        <w:t xml:space="preserve">Klee watched him carefully, but no. Not a flicker. </w:t>
+      </w:r>
+    </w:p>
+    <w:p>
+      <w:proofErr w:type="gramStart"/>
+      <w:r>
+        <w:t>I did meet</w:t>
+      </w:r>
+      <w:proofErr w:type="gramEnd"/>
+      <w:r>
+        <w:t xml:space="preserve"> him, yes. Just the once. At the solicitor</w:t>
+      </w:r>
+      <w:r>
+        <w:t>’</w:t>
+      </w:r>
+      <w:r>
+        <w:t>s office, when we exchanged contracts.</w:t>
+      </w:r>
+    </w:p>
+    <w:p>
+      <w:r>
+        <w:t xml:space="preserve">Klee </w:t>
+      </w:r>
+      <w:proofErr w:type="gramStart"/>
+      <w:r>
+        <w:t>faffed with</w:t>
+      </w:r>
+      <w:proofErr w:type="gramEnd"/>
+      <w:r>
+        <w:t xml:space="preserve"> his phone for a second. Was this him? Klee showed Johnson a picture of Dobby. </w:t>
+      </w:r>
+    </w:p>
+    <w:p>
+      <w:r>
+        <w:t>“Good lord, as I say. It was thirty years ago.” He peered at the photo on Klee’s phone. “It could have been.” Ah yes! I remember the</w:t>
+      </w:r>
+      <w:r>
+        <w:t xml:space="preserve"> eyebrows, those glasses. Not in fashion now, I would guess.</w:t>
+      </w:r>
+      <w:r>
+        <w:t xml:space="preserve"> And that mole! It’s quite distinctive. </w:t>
+      </w:r>
+    </w:p>
+    <w:p>
+      <w:r>
+        <w:t>“Did you get any sense where the money was coming from?”</w:t>
+      </w:r>
+    </w:p>
+    <w:p>
+      <w:r>
+        <w:t xml:space="preserve">Johnson looked concerned. </w:t>
+      </w:r>
+      <w:r>
+        <w:t>There was an awkward pause.</w:t>
+      </w:r>
+    </w:p>
+    <w:p>
+      <w:r>
+        <w:t>“No, I didn’t.”</w:t>
+      </w:r>
+    </w:p>
+    <w:p>
+      <w:r>
+        <w:t>One of the weird things about being a policeman, although he wasn’t one anymore, Klee thought at that moment, and had often thought in the past, was how bad he felt when realized he was dealing with someone who was completely honest,</w:t>
+      </w:r>
+      <w:r>
+        <w:t xml:space="preserve"> but </w:t>
+      </w:r>
+      <w:r>
+        <w:t xml:space="preserve">he was going to have to lean on them. He wasn’t going to have to lean on Johnson </w:t>
+      </w:r>
+      <w:r>
+        <w:t xml:space="preserve">very </w:t>
+      </w:r>
+      <w:r>
+        <w:t>hard. And anyway, he had no authority. Pastor Johnson could just tell him to fuck off and shut the door to his portacabin. He wasn’t going to stick his foot in the door if the pastor did that.</w:t>
+      </w:r>
+    </w:p>
+    <w:p>
+      <w:r>
         <w:lastRenderedPageBreak/>
-        <w:t>“He promised he was going to repair the roof, that was part of the deal with the council – that’s the only reason they allowed him to turn it into a private residence.”</w:t>
+        <w:t>“Look,” Pastor Johnson continued.</w:t>
+      </w:r>
+      <w:r>
+        <w:t xml:space="preserve"> Klee couldn’t quite believe it. Johnson was already confessing! This man should never go near a police station.</w:t>
+      </w:r>
+      <w:r>
+        <w:t xml:space="preserve"> “</w:t>
+      </w:r>
+      <w:proofErr w:type="spellStart"/>
+      <w:r>
+        <w:t>Mr</w:t>
+      </w:r>
+      <w:proofErr w:type="spellEnd"/>
+      <w:r>
+        <w:t xml:space="preserve"> Grafton said it was all above board. And it happens more often than you might think</w:t>
+      </w:r>
+      <w:r>
+        <w:t>.”</w:t>
+      </w:r>
+    </w:p>
+    <w:p>
+      <w:r>
+        <w:t>Klee said nothing. Whenever he could in an interrogation, he said nothing.</w:t>
       </w:r>
     </w:p>
     <w:p>
@@ -363,630 +669,493 @@
         <w:t>“</w:t>
       </w:r>
       <w:r>
-        <w:t>Who was this?”</w:t>
-      </w:r>
-      <w:r>
-        <w:br/>
+        <w:t>Mr. Grafton</w:t>
+      </w:r>
+      <w:r>
+        <w:t xml:space="preserve"> was</w:t>
+      </w:r>
+      <w:r>
+        <w:t xml:space="preserve"> our solicitor. It was the first time we’d dealt with him – but we’d dealt with his father for years – although his father, I think would have advised against selling the chapel.”</w:t>
+      </w:r>
+    </w:p>
+    <w:p>
+      <w:r>
+        <w:t>“Why is that?”</w:t>
+      </w:r>
+      <w:r>
+        <w:br/>
+        <w:t>“He didn’t agree you see.”</w:t>
+      </w:r>
+      <w:r>
+        <w:br/>
+        <w:t>“With what?”</w:t>
+      </w:r>
+      <w:r>
+        <w:br/>
+        <w:t>“Well, that the world was going to end.”</w:t>
+      </w:r>
+      <w:r>
+        <w:br/>
+        <w:t>“I’m sorry.”</w:t>
+      </w:r>
+      <w:r>
+        <w:br/>
+      </w:r>
+      <w:r>
+        <w:t xml:space="preserve">“Maybe you’ve forgotten this </w:t>
+      </w:r>
+      <w:proofErr w:type="spellStart"/>
+      <w:r>
+        <w:t>Mr</w:t>
+      </w:r>
+      <w:proofErr w:type="spellEnd"/>
+      <w:r>
+        <w:t xml:space="preserve"> Klee. I mean it does sound rather silly now</w:t>
+      </w:r>
+      <w:r>
+        <w:t xml:space="preserve">, but in the mid-nineties, it was all the rage. The idea that the world might end in the year 2000. </w:t>
+      </w:r>
+      <w:r>
+        <w:t xml:space="preserve">There was all that </w:t>
+      </w:r>
+      <w:proofErr w:type="gramStart"/>
+      <w:r>
+        <w:t>talk</w:t>
+      </w:r>
+      <w:proofErr w:type="gramEnd"/>
+      <w:r>
+        <w:t xml:space="preserve"> about the </w:t>
+      </w:r>
+      <w:proofErr w:type="spellStart"/>
+      <w:r>
+        <w:t>millenium</w:t>
+      </w:r>
+      <w:proofErr w:type="spellEnd"/>
+      <w:r>
+        <w:t xml:space="preserve"> bug. </w:t>
+      </w:r>
+      <w:r>
+        <w:t xml:space="preserve">And, as well as </w:t>
+      </w:r>
+      <w:proofErr w:type="gramStart"/>
+      <w:r>
+        <w:t>the materialism</w:t>
+      </w:r>
+      <w:proofErr w:type="gramEnd"/>
+      <w:r>
+        <w:t>, the obsession with ear</w:t>
+      </w:r>
+      <w:r>
+        <w:t>th</w:t>
+      </w:r>
+      <w:r>
+        <w:t xml:space="preserve">ly things, it persuaded several of the elders in our </w:t>
+      </w:r>
+      <w:proofErr w:type="gramStart"/>
+      <w:r>
+        <w:t>church,</w:t>
+      </w:r>
+      <w:proofErr w:type="gramEnd"/>
+      <w:r>
+        <w:t xml:space="preserve"> that instead of raising money for the roof, we should prepare, well prepare for taking our place in heaven. Mr. Grafton senior would have </w:t>
+      </w:r>
+      <w:proofErr w:type="gramStart"/>
+      <w:r>
+        <w:t>talked us out of</w:t>
+      </w:r>
+      <w:proofErr w:type="gramEnd"/>
+      <w:r>
+        <w:t xml:space="preserve"> it, I think. But that spring, he’d had a stroke, so it was Mr. </w:t>
+      </w:r>
+      <w:proofErr w:type="gramStart"/>
+      <w:r>
+        <w:t>Grafton</w:t>
+      </w:r>
+      <w:proofErr w:type="gramEnd"/>
+      <w:r>
+        <w:t xml:space="preserve"> the younger that we were dealing with. And he seemed </w:t>
+      </w:r>
+      <w:proofErr w:type="gramStart"/>
+      <w:r>
+        <w:t>really keen</w:t>
+      </w:r>
+      <w:proofErr w:type="gramEnd"/>
+      <w:r>
+        <w:t xml:space="preserve"> to help.”</w:t>
+      </w:r>
+    </w:p>
+    <w:p>
+      <w:r>
+        <w:t>I bet he was</w:t>
+      </w:r>
+      <w:r>
+        <w:t>,</w:t>
+      </w:r>
+      <w:r>
+        <w:t xml:space="preserve"> thought Klee.</w:t>
+      </w:r>
+    </w:p>
+    <w:p>
+      <w:r>
+        <w:t>“And he assured us that it was perfectly normal. And that it happens all the time.”</w:t>
+      </w:r>
+    </w:p>
+    <w:p>
+      <w:r>
+        <w:t>Klee shifted his expression. He raised his eyebrows. He could have, and would have, if forced, said “What happens all the time</w:t>
+      </w:r>
+      <w:r>
+        <w:t>?”</w:t>
+      </w:r>
+      <w:r>
+        <w:t xml:space="preserve"> But he knew that things tended to go more smoothly if he didn’t.</w:t>
+      </w:r>
+    </w:p>
+    <w:p>
+      <w:r>
         <w:t>“</w:t>
       </w:r>
+      <w:r>
+        <w:t>It happens all the time t</w:t>
+      </w:r>
+      <w:r>
+        <w:t>hat houses, well property, gets paid for in cash.”</w:t>
+      </w:r>
+    </w:p>
+    <w:p>
+      <w:r>
+        <w:t>“Cash?”</w:t>
+      </w:r>
+      <w:r>
+        <w:br/>
+        <w:t xml:space="preserve">“Yes, </w:t>
+      </w:r>
       <w:proofErr w:type="spellStart"/>
       <w:r>
         <w:t>Mr</w:t>
       </w:r>
       <w:proofErr w:type="spellEnd"/>
       <w:r>
-        <w:t xml:space="preserve"> – I’m sorry </w:t>
+        <w:t xml:space="preserve"> </w:t>
       </w:r>
       <w:proofErr w:type="spellStart"/>
       <w:r>
+        <w:t>D’Aubeilles</w:t>
+      </w:r>
+      <w:proofErr w:type="spellEnd"/>
+      <w:r>
+        <w:t xml:space="preserve"> paid for the property in cash. He explained that he had sold </w:t>
+      </w:r>
+      <w:r>
+        <w:t>his farm in – I think it was, was it South Africa? Something like that.”</w:t>
+      </w:r>
+    </w:p>
+    <w:p>
+      <w:r>
+        <w:t>“Did you actually see the cash?”</w:t>
+      </w:r>
+    </w:p>
+    <w:p>
+      <w:r>
+        <w:t xml:space="preserve">“Oh, no, no, no. </w:t>
+      </w:r>
+      <w:proofErr w:type="spellStart"/>
+      <w:r>
         <w:t>Mr</w:t>
       </w:r>
       <w:proofErr w:type="spellEnd"/>
       <w:r>
-        <w:t xml:space="preserve"> Klee, it has been over thirty years. It was something French. </w:t>
+        <w:t xml:space="preserve"> Grafton dealt with all of that.”</w:t>
+      </w:r>
+      <w:r>
+        <w:br/>
+      </w:r>
+      <w:r>
+        <w:t xml:space="preserve">What was it that Dobby had learned from his first, hugely successful job? </w:t>
+      </w:r>
+      <w:r>
+        <w:t>A bent accountant. A bent lawyer.</w:t>
+      </w:r>
+      <w:r>
+        <w:t xml:space="preserve"> If you were going to do armed robbery, you needed both.</w:t>
+      </w:r>
+    </w:p>
+    <w:p>
+      <w:r>
+        <w:t>“And did you follow what happened to the chapel after you left?”</w:t>
+      </w:r>
+      <w:r>
+        <w:br/>
+        <w:t xml:space="preserve">“Well, no </w:t>
       </w:r>
       <w:proofErr w:type="spellStart"/>
       <w:r>
-        <w:t>D’Aubilles</w:t>
+        <w:t>Mr</w:t>
       </w:r>
       <w:proofErr w:type="spellEnd"/>
       <w:r>
-        <w:t xml:space="preserve"> that was it. The pastor pronounced all the letters in the name, even though he’d said it was French, so it sounded like “</w:t>
+        <w:t xml:space="preserve"> Klee, that was rather the point. We’d been trying to fix the roof for ten years</w:t>
+      </w:r>
+      <w:r>
+        <w:t xml:space="preserve"> by the time we sold it</w:t>
+      </w:r>
+      <w:r>
+        <w:t xml:space="preserve">. And it had rather taken over our mission as a church. I prayed </w:t>
+      </w:r>
+      <w:r>
+        <w:lastRenderedPageBreak/>
+        <w:t>about it – first asking for the boss to send us the money!”</w:t>
+      </w:r>
+      <w:r>
+        <w:br/>
+        <w:t>“The boss?”</w:t>
+      </w:r>
+    </w:p>
+    <w:p>
+      <w:r>
+        <w:t>Johnson vaguely pointed upwards</w:t>
+      </w:r>
+      <w:r>
+        <w:t xml:space="preserve"> and smiled an embarrassed, weak, smile.</w:t>
+      </w:r>
+      <w:r>
+        <w:t xml:space="preserve"> </w:t>
+      </w:r>
+    </w:p>
+    <w:p>
+      <w:r>
+        <w:t xml:space="preserve">“I know. Cliched, and utterly stupid. </w:t>
+      </w:r>
+      <w:r>
+        <w:t>But w</w:t>
+      </w:r>
+      <w:r>
+        <w:t>e were bewitched by the roof. Eventually, with the help of some of the elders, and a bit more prayer,</w:t>
+      </w:r>
+      <w:r>
+        <w:t xml:space="preserve"> </w:t>
+      </w:r>
+      <w:proofErr w:type="gramStart"/>
+      <w:r>
+        <w:t>and also</w:t>
+      </w:r>
+      <w:proofErr w:type="gramEnd"/>
+      <w:r>
+        <w:t>, this nagging worry that the world might end half-way through our roof restoration,</w:t>
+      </w:r>
+      <w:r>
+        <w:t xml:space="preserve"> we came to</w:t>
+      </w:r>
+      <w:r>
+        <w:t xml:space="preserve"> understand</w:t>
+      </w:r>
+      <w:r>
+        <w:t xml:space="preserve"> that we were </w:t>
+      </w:r>
+      <w:proofErr w:type="gramStart"/>
+      <w:r>
+        <w:t>fixated</w:t>
+      </w:r>
+      <w:proofErr w:type="gramEnd"/>
+      <w:r>
+        <w:t xml:space="preserve"> on the building</w:t>
+      </w:r>
+      <w:r>
+        <w:t>, idolatrous, we realized it was</w:t>
+      </w:r>
+      <w:r>
+        <w:t>. We should refocus on our actual mission. Talking to people about Jesus. It really is a good message you know</w:t>
+      </w:r>
+      <w:r>
+        <w:t xml:space="preserve">… </w:t>
       </w:r>
       <w:proofErr w:type="spellStart"/>
       <w:r>
-        <w:t>D</w:t>
-      </w:r>
-      <w:r>
-        <w:t>obilez</w:t>
+        <w:t>Mr</w:t>
       </w:r>
       <w:proofErr w:type="spellEnd"/>
       <w:r>
-        <w:t xml:space="preserve">”. </w:t>
-      </w:r>
-    </w:p>
-    <w:p>
-      <w:r>
-        <w:t xml:space="preserve">“Did you even meet </w:t>
+        <w:t xml:space="preserve"> Klee, you say you’re a live-in guardian. Y</w:t>
+      </w:r>
+      <w:r>
+        <w:t>ou’ll forgive me, but isn’t this – what’s the word they use now? Isn’t this a bit of a case of security guard overreach?”</w:t>
+      </w:r>
+    </w:p>
+    <w:p>
+      <w:r>
+        <w:t xml:space="preserve"> </w:t>
+      </w:r>
+      <w:r>
+        <w:t>“Did Mr</w:t>
+      </w:r>
+      <w:r>
+        <w:t>.</w:t>
+      </w:r>
+      <w:r>
+        <w:t xml:space="preserve"> Grafton have any concerns</w:t>
+      </w:r>
+      <w:r>
+        <w:t xml:space="preserve"> at all</w:t>
+      </w:r>
+      <w:r>
+        <w:t>?</w:t>
+      </w:r>
+      <w:r>
+        <w:t xml:space="preserve"> About Mr. </w:t>
       </w:r>
       <w:proofErr w:type="spellStart"/>
       <w:r>
-        <w:t>Mr</w:t>
+        <w:t>D’Aubeilles</w:t>
       </w:r>
       <w:proofErr w:type="spellEnd"/>
       <w:r>
-        <w:t xml:space="preserve"> D’Aubilles.” Klee realized that it sounded like he was being a dick pronouncing it “Dough Bee.” But also realized he </w:t>
+        <w:t xml:space="preserve"> paying in cash</w:t>
+      </w:r>
+      <w:r>
+        <w:t>,</w:t>
+      </w:r>
+      <w:r>
+        <w:t>”</w:t>
+      </w:r>
+      <w:r>
+        <w:t xml:space="preserve"> </w:t>
+      </w:r>
+      <w:r>
+        <w:t>Klee ignored him and came back to the subject at hand, or at least the subject that he wanted to be at hand</w:t>
+      </w:r>
+      <w:r>
+        <w:t>.</w:t>
+      </w:r>
+      <w:r>
+        <w:br/>
+        <w:t>“Yes, he did. He made sure that we filled in all the appropriate paperwork. But then he said that beyond that we didn’t have to worry. Everything was above board.</w:t>
+      </w:r>
+      <w:r>
+        <w:t xml:space="preserve"> Of course, there was extra work involved, counting the cash and so on which meant…</w:t>
+      </w:r>
+      <w:r>
+        <w:t>”</w:t>
+      </w:r>
+      <w:r>
+        <w:br/>
+        <w:t xml:space="preserve">Pastor Joseph Johnson, Klee thought, was probably about as innocent as a grown man could be. But he wasn’t stupid. Klee could see him doing the </w:t>
+      </w:r>
+      <w:proofErr w:type="spellStart"/>
+      <w:r>
+        <w:t>maths</w:t>
+      </w:r>
+      <w:proofErr w:type="spellEnd"/>
+      <w:r>
+        <w:t xml:space="preserve"> now that maybe he should have done thirty years ago.</w:t>
+      </w:r>
+    </w:p>
+    <w:p>
+      <w:r>
+        <w:t xml:space="preserve">Grafton had taken a </w:t>
       </w:r>
       <w:proofErr w:type="gramStart"/>
       <w:r>
-        <w:t>need</w:t>
+        <w:t>cut</w:t>
       </w:r>
       <w:proofErr w:type="gramEnd"/>
       <w:r>
-        <w:t xml:space="preserve"> to lean on that pronunciation to see if it registered at all with Johnson. Say it. Dobby. </w:t>
-      </w:r>
-    </w:p>
-    <w:p>
-      <w:r>
-        <w:t xml:space="preserve">Klee watched him carefully, but no. Not a flicker. </w:t>
-      </w:r>
-    </w:p>
-    <w:p>
+        <w:t xml:space="preserve"> hadn’t he? Probably from both ends.</w:t>
+      </w:r>
+    </w:p>
+    <w:p>
+      <w:r>
+        <w:t>“…an additional fee.” Johnston tailed off.</w:t>
+      </w:r>
+    </w:p>
+    <w:p>
+      <w:r>
+        <w:t>It was Grafton he needed to see next.</w:t>
+      </w:r>
+      <w:r>
+        <w:t xml:space="preserve"> But before he got on to that, he</w:t>
+      </w:r>
+      <w:r>
+        <w:t xml:space="preserve"> found himself asking a</w:t>
+      </w:r>
+      <w:r>
+        <w:t xml:space="preserve"> question that</w:t>
+      </w:r>
+      <w:r>
+        <w:t xml:space="preserve"> </w:t>
+      </w:r>
+      <w:r>
+        <w:t>he used to ask a lot more.</w:t>
+      </w:r>
+      <w:r>
+        <w:t xml:space="preserve"> And given that he was </w:t>
+      </w:r>
       <w:proofErr w:type="gramStart"/>
       <w:r>
-        <w:t>I did meet</w:t>
+        <w:t>absolutely certain</w:t>
       </w:r>
       <w:proofErr w:type="gramEnd"/>
       <w:r>
-        <w:t xml:space="preserve"> him, yes. Just the once. At the solicitor</w:t>
-      </w:r>
-      <w:r>
-        <w:t>’</w:t>
-      </w:r>
-      <w:r>
-        <w:t>s office, when we exchanged contracts.</w:t>
-      </w:r>
-    </w:p>
-    <w:p>
-      <w:r>
-        <w:t xml:space="preserve">Klee </w:t>
+        <w:t xml:space="preserve"> that Johnson was innocent, of any crime – other than </w:t>
       </w:r>
       <w:proofErr w:type="gramStart"/>
       <w:r>
-        <w:t>faffed with</w:t>
+        <w:t>actually believing</w:t>
       </w:r>
       <w:proofErr w:type="gramEnd"/>
       <w:r>
-        <w:t xml:space="preserve"> his phone for a second. Was this him? Klee showed Johnson a picture of Dobby. </w:t>
-      </w:r>
-    </w:p>
-    <w:p>
-      <w:r>
-        <w:t>“Good lord, as I say. It was thirty years ago.” He peered at the photo on Klee’s phone. “It could have been.” Ah yes! I remember the</w:t>
-      </w:r>
-      <w:r>
-        <w:t xml:space="preserve"> eyebrows, those glasses. Not in fashion now, I would guess.</w:t>
-      </w:r>
-      <w:r>
-        <w:t xml:space="preserve"> And that mole! It’s quite distinctive. </w:t>
-      </w:r>
-    </w:p>
-    <w:p>
-      <w:r>
-        <w:t>“Did you get any sense where the money was coming from?”</w:t>
-      </w:r>
-    </w:p>
-    <w:p>
-      <w:r>
-        <w:t xml:space="preserve">Johnson looked concerned. </w:t>
-      </w:r>
-      <w:r>
-        <w:t>There was an awkward pause.</w:t>
-      </w:r>
-    </w:p>
-    <w:p>
-      <w:r>
-        <w:t>“No, I didn’t.”</w:t>
-      </w:r>
-    </w:p>
-    <w:p>
-      <w:r>
-        <w:t>One of the weird things about being a policeman, although he wasn’t one anymore, Klee thought at that moment, and had often thought in the past, was how bad he felt when realized he was dealing with someone who was completely honest,</w:t>
-      </w:r>
-      <w:r>
-        <w:t xml:space="preserve"> but </w:t>
-      </w:r>
-      <w:r>
-        <w:t xml:space="preserve">he was going to have to lean on them. He wasn’t going to have to lean on Johnson </w:t>
-      </w:r>
-      <w:r>
-        <w:t xml:space="preserve">very </w:t>
-      </w:r>
-      <w:r>
-        <w:t>hard. And anyway, he had no authority. Pastor Johnson could just tell him to fuck off and shut the door to his portacabin. He wasn’t going to stick his foot in the door if the pastor did that.</w:t>
-      </w:r>
-    </w:p>
-    <w:p>
-      <w:r>
-        <w:t>“Look,” Pastor Johnson continued.</w:t>
-      </w:r>
-      <w:r>
-        <w:t xml:space="preserve"> Klee couldn’t quite believe it. Johnson was already confessing! This man should never go near a police station.</w:t>
-      </w:r>
-      <w:r>
-        <w:t xml:space="preserve"> “</w:t>
-      </w:r>
-      <w:proofErr w:type="spellStart"/>
-      <w:r>
-        <w:t>Mr</w:t>
-      </w:r>
-      <w:proofErr w:type="spellEnd"/>
-      <w:r>
-        <w:t xml:space="preserve"> Grafton said it was all above board. And it happens more often than you might think</w:t>
-      </w:r>
-      <w:r>
-        <w:t>.”</w:t>
-      </w:r>
-    </w:p>
-    <w:p>
-      <w:r>
-        <w:t>Klee said nothing. Whenever he could in an interrogation, he said nothing.</w:t>
-      </w:r>
-    </w:p>
-    <w:p>
-      <w:r>
-        <w:t>“</w:t>
-      </w:r>
-      <w:r>
-        <w:t>Mr. Grafton</w:t>
-      </w:r>
-      <w:r>
-        <w:t xml:space="preserve"> was</w:t>
-      </w:r>
-      <w:r>
-        <w:t xml:space="preserve"> our solicitor. It was the first time we’d dealt with him – but we’d dealt with his father for years – although his father, I think would have advised against selling the chapel.”</w:t>
+        <w:t xml:space="preserve"> that the world was going end because the year had a certain number of zeros on the end of it – seemed a bit abrupt.</w:t>
+      </w:r>
+    </w:p>
+    <w:p>
+      <w:r>
+        <w:t>“What did you do with the money?”</w:t>
+      </w:r>
+    </w:p>
+    <w:p>
+      <w:r>
+        <w:t>“Well, I know this is a bit of a cliché, but we sent, well we still do, we sen</w:t>
+      </w:r>
+      <w:r>
+        <w:t>t</w:t>
+      </w:r>
+      <w:r>
+        <w:t xml:space="preserve"> it to Africa</w:t>
+      </w:r>
+      <w:r>
+        <w:t>, we raise money now you see</w:t>
+      </w:r>
+      <w:r>
+        <w:t>. My church frowns on missionary work. But it encourages schooling, education, free thought! So, we use it to support several schools. As a matter of fact, my son is there working at one right now.”</w:t>
+      </w:r>
+    </w:p>
+    <w:p>
+      <w:r>
+        <w:t>“Do you still do business with Mr</w:t>
+      </w:r>
+      <w:r>
+        <w:t>.</w:t>
+      </w:r>
+      <w:r>
+        <w:t xml:space="preserve"> Grafton.”</w:t>
+      </w:r>
+    </w:p>
+    <w:p>
+      <w:r>
+        <w:t>“Well, actually, no.”</w:t>
+      </w:r>
+    </w:p>
+    <w:p>
+      <w:r>
+        <w:t>“No?”</w:t>
+      </w:r>
+      <w:r>
+        <w:br/>
+        <w:t>“No.”</w:t>
       </w:r>
     </w:p>
     <w:p>
       <w:r>
         <w:lastRenderedPageBreak/>
-        <w:t>“Why is that?”</w:t>
-      </w:r>
-      <w:r>
-        <w:br/>
-        <w:t>“He didn’t agree you see.”</w:t>
-      </w:r>
-      <w:r>
-        <w:br/>
-        <w:t>“With what?”</w:t>
-      </w:r>
-      <w:r>
-        <w:br/>
-        <w:t>“Well, that the world was going to end.”</w:t>
-      </w:r>
-      <w:r>
-        <w:br/>
-        <w:t>“I’m sorry.”</w:t>
-      </w:r>
-      <w:r>
-        <w:br/>
-      </w:r>
-      <w:r>
-        <w:t xml:space="preserve">“Maybe you’ve forgotten this </w:t>
-      </w:r>
-      <w:proofErr w:type="spellStart"/>
-      <w:r>
-        <w:t>Mr</w:t>
-      </w:r>
-      <w:proofErr w:type="spellEnd"/>
-      <w:r>
-        <w:t xml:space="preserve"> Klee. I mean it does sound rather silly now</w:t>
-      </w:r>
-      <w:r>
-        <w:t xml:space="preserve">, but in the mid-nineties, it was all the rage. The idea that the world might end in the year 2000. And, as well as </w:t>
-      </w:r>
-      <w:proofErr w:type="gramStart"/>
-      <w:r>
-        <w:t>the materialism</w:t>
-      </w:r>
-      <w:proofErr w:type="gramEnd"/>
-      <w:r>
-        <w:t>, the obsession with ear</w:t>
-      </w:r>
-      <w:r>
-        <w:t>th</w:t>
-      </w:r>
-      <w:r>
-        <w:t xml:space="preserve">ly things, it persuaded several of the elders in our </w:t>
-      </w:r>
-      <w:proofErr w:type="gramStart"/>
-      <w:r>
-        <w:t>church,</w:t>
-      </w:r>
-      <w:proofErr w:type="gramEnd"/>
-      <w:r>
-        <w:t xml:space="preserve"> that instead of raising money for the roof, we should prepare, well prepare for taking our place in heaven. Mr. Grafton senior would have </w:t>
-      </w:r>
-      <w:proofErr w:type="gramStart"/>
-      <w:r>
-        <w:t>talked us out of</w:t>
-      </w:r>
-      <w:proofErr w:type="gramEnd"/>
-      <w:r>
-        <w:t xml:space="preserve"> it, I think. But that spring, he’d had a stroke, so it was Mr. </w:t>
-      </w:r>
-      <w:proofErr w:type="gramStart"/>
-      <w:r>
-        <w:t>Grafton</w:t>
-      </w:r>
-      <w:proofErr w:type="gramEnd"/>
-      <w:r>
-        <w:t xml:space="preserve"> the younger that we were dealing with. And he seemed </w:t>
-      </w:r>
-      <w:proofErr w:type="gramStart"/>
-      <w:r>
-        <w:t>really keen</w:t>
-      </w:r>
-      <w:proofErr w:type="gramEnd"/>
-      <w:r>
-        <w:t xml:space="preserve"> to help.”</w:t>
-      </w:r>
-    </w:p>
-    <w:p>
-      <w:r>
-        <w:t>I bet he was</w:t>
-      </w:r>
-      <w:r>
-        <w:t xml:space="preserve"> </w:t>
-      </w:r>
-      <w:proofErr w:type="gramStart"/>
-      <w:r>
-        <w:t>thought</w:t>
-      </w:r>
-      <w:proofErr w:type="gramEnd"/>
-      <w:r>
-        <w:t xml:space="preserve"> Klee.</w:t>
-      </w:r>
-    </w:p>
-    <w:p>
-      <w:r>
-        <w:t>“And he assured us that it was perfectly normal. And that it happens all the time.”</w:t>
-      </w:r>
-    </w:p>
-    <w:p>
-      <w:r>
-        <w:t>Klee shifted his expression. He raised his eyebrows. He could have, and would have, if forced, said “What happens all the time. But he knew that things tended to go more smoothly if he didn’t.</w:t>
-      </w:r>
-    </w:p>
-    <w:p>
-      <w:r>
-        <w:t>“</w:t>
-      </w:r>
-      <w:r>
-        <w:t>It happens all the time t</w:t>
-      </w:r>
-      <w:r>
-        <w:t>hat houses, well property, gets paid for in cash.”</w:t>
-      </w:r>
-    </w:p>
-    <w:p>
-      <w:r>
-        <w:t>“Cash?”</w:t>
-      </w:r>
-      <w:r>
-        <w:br/>
-        <w:t xml:space="preserve">“Yes, </w:t>
-      </w:r>
-      <w:proofErr w:type="spellStart"/>
-      <w:r>
-        <w:t>Mr</w:t>
-      </w:r>
-      <w:proofErr w:type="spellEnd"/>
-      <w:r>
-        <w:t xml:space="preserve"> </w:t>
-      </w:r>
-      <w:proofErr w:type="spellStart"/>
-      <w:proofErr w:type="gramStart"/>
-      <w:r>
-        <w:t>D’Aubeilles</w:t>
-      </w:r>
-      <w:proofErr w:type="spellEnd"/>
-      <w:r>
-        <w:t xml:space="preserve">  paid</w:t>
-      </w:r>
-      <w:proofErr w:type="gramEnd"/>
-      <w:r>
-        <w:t xml:space="preserve"> for the property in cash. He explained that he had sold </w:t>
-      </w:r>
-      <w:r>
-        <w:t>his farm in – I think it was, was it South Africa? Something like that.”</w:t>
-      </w:r>
-    </w:p>
-    <w:p>
-      <w:r>
-        <w:t>“Did you actually see the cash?”</w:t>
-      </w:r>
-    </w:p>
-    <w:p>
-      <w:r>
-        <w:t xml:space="preserve">“Oh, no, no, no. </w:t>
-      </w:r>
-      <w:proofErr w:type="spellStart"/>
-      <w:r>
-        <w:t>Mr</w:t>
-      </w:r>
-      <w:proofErr w:type="spellEnd"/>
-      <w:r>
-        <w:t xml:space="preserve"> Grafton dealt with all of that.”</w:t>
-      </w:r>
-      <w:r>
-        <w:br/>
-        <w:t>A bent accountant. A bent lawyer.</w:t>
-      </w:r>
-      <w:r>
-        <w:t xml:space="preserve"> If you were going to do armed robbery, you needed both.</w:t>
-      </w:r>
-    </w:p>
-    <w:p>
-      <w:r>
-        <w:t>“And did you follow what happened to the chapel after you left?”</w:t>
-      </w:r>
-      <w:r>
-        <w:br/>
-        <w:t xml:space="preserve">“Well, no </w:t>
-      </w:r>
-      <w:proofErr w:type="spellStart"/>
-      <w:r>
-        <w:t>Mr</w:t>
-      </w:r>
-      <w:proofErr w:type="spellEnd"/>
-      <w:r>
-        <w:t xml:space="preserve"> Klee, that was rather the point. We’d been trying to fix the roof for ten years</w:t>
-      </w:r>
-      <w:r>
-        <w:t xml:space="preserve"> by the time we sold it</w:t>
-      </w:r>
-      <w:r>
-        <w:t>. And it had rather taken over our mission as a church. I prayed about it – first asking for the boss to send us the money!”</w:t>
-      </w:r>
-      <w:r>
-        <w:br/>
-        <w:t>“The boss?”</w:t>
-      </w:r>
-    </w:p>
-    <w:p>
-      <w:r>
-        <w:t>Johnson vaguely pointed upwards</w:t>
-      </w:r>
-      <w:r>
-        <w:t xml:space="preserve"> and smiled an embarrassed, weak, smile.</w:t>
-      </w:r>
-      <w:r>
-        <w:t xml:space="preserve"> </w:t>
-      </w:r>
-    </w:p>
-    <w:p>
-      <w:r>
-        <w:t xml:space="preserve">“I know. Cliched, and utterly stupid. </w:t>
-      </w:r>
-      <w:r>
-        <w:t>But w</w:t>
-      </w:r>
-      <w:r>
-        <w:t>e were bewitched by the roof. Eventually, with the help of some of the elders, and a bit more prayer,</w:t>
-      </w:r>
-      <w:r>
-        <w:t xml:space="preserve"> </w:t>
-      </w:r>
-      <w:proofErr w:type="gramStart"/>
-      <w:r>
-        <w:t>and also</w:t>
-      </w:r>
-      <w:proofErr w:type="gramEnd"/>
-      <w:r>
-        <w:t>, this nagging worry that the world might end half-way through our roof restoration,</w:t>
-      </w:r>
-      <w:r>
-        <w:t xml:space="preserve"> we came to</w:t>
-      </w:r>
-      <w:r>
-        <w:t xml:space="preserve"> understand</w:t>
-      </w:r>
-      <w:r>
-        <w:t xml:space="preserve"> that we were </w:t>
-      </w:r>
-      <w:proofErr w:type="gramStart"/>
-      <w:r>
-        <w:t>fixated</w:t>
-      </w:r>
-      <w:proofErr w:type="gramEnd"/>
-      <w:r>
-        <w:t xml:space="preserve"> on the building. We should refocus on our actual mission. Talking to people about Jesus. It really is a good message you know</w:t>
-      </w:r>
-      <w:r>
-        <w:t xml:space="preserve">… </w:t>
-      </w:r>
-      <w:proofErr w:type="spellStart"/>
-      <w:r>
-        <w:t>Mr</w:t>
-      </w:r>
-      <w:proofErr w:type="spellEnd"/>
-      <w:r>
-        <w:t xml:space="preserve"> Klee, you say you’re a </w:t>
-      </w:r>
-      <w:r>
-        <w:lastRenderedPageBreak/>
-        <w:t>live-in guardian. Y</w:t>
-      </w:r>
-      <w:r>
-        <w:t>ou’ll forgive me, but isn’t this – what’s the word they use now? Isn’t this a bit of a case of security guard overreach?”</w:t>
-      </w:r>
-    </w:p>
-    <w:p>
-      <w:r>
-        <w:t>“Did Mr</w:t>
-      </w:r>
-      <w:r>
-        <w:t>.</w:t>
-      </w:r>
-      <w:r>
-        <w:t xml:space="preserve"> Grafton have any concerns</w:t>
-      </w:r>
-      <w:r>
-        <w:t xml:space="preserve"> at all</w:t>
-      </w:r>
-      <w:r>
-        <w:t>?</w:t>
-      </w:r>
-      <w:r>
-        <w:t xml:space="preserve"> About Mr. </w:t>
-      </w:r>
-      <w:proofErr w:type="spellStart"/>
-      <w:r>
-        <w:t>D’Aubeilles</w:t>
-      </w:r>
-      <w:proofErr w:type="spellEnd"/>
-      <w:r>
-        <w:t xml:space="preserve"> paying in cash</w:t>
-      </w:r>
-      <w:r>
-        <w:t>,</w:t>
-      </w:r>
-      <w:r>
-        <w:t>”</w:t>
-      </w:r>
-      <w:r>
-        <w:t xml:space="preserve"> blithely changing the subject.</w:t>
-      </w:r>
-      <w:r>
-        <w:br/>
-        <w:t>“Yes, he did. He made sure that we filled in all the appropriate paperwork. But then he said that beyond that we didn’t have to worry. Everything was above board.</w:t>
-      </w:r>
-      <w:r>
-        <w:t xml:space="preserve"> Of course, there was extra work involved, counting the cash and so on which meant…</w:t>
-      </w:r>
-      <w:r>
-        <w:t>”</w:t>
-      </w:r>
-      <w:r>
-        <w:br/>
-        <w:t xml:space="preserve">Pastor Joseph Johnson, Klee thought, was probably about as innocent as a grown man could be. But he wasn’t stupid. Klee could see him doing the </w:t>
-      </w:r>
-      <w:proofErr w:type="spellStart"/>
-      <w:r>
-        <w:t>maths</w:t>
-      </w:r>
-      <w:proofErr w:type="spellEnd"/>
-      <w:r>
-        <w:t xml:space="preserve"> now that maybe he should have done thirty years ago.</w:t>
-      </w:r>
-    </w:p>
-    <w:p>
-      <w:r>
-        <w:t xml:space="preserve">Grafton had taken a </w:t>
-      </w:r>
-      <w:proofErr w:type="gramStart"/>
-      <w:r>
-        <w:t>cut</w:t>
-      </w:r>
-      <w:proofErr w:type="gramEnd"/>
-      <w:r>
-        <w:t xml:space="preserve"> hadn’t he? Probably from both ends.</w:t>
-      </w:r>
-    </w:p>
-    <w:p>
-      <w:r>
-        <w:t>“…an additional fee.” Johnston tailed off.</w:t>
-      </w:r>
-    </w:p>
-    <w:p>
-      <w:r>
-        <w:t>It was Grafton he needed to see next.</w:t>
-      </w:r>
-      <w:r>
-        <w:t xml:space="preserve"> But before he got on to that, he</w:t>
-      </w:r>
-      <w:r>
-        <w:t xml:space="preserve"> found himself asking a</w:t>
-      </w:r>
-      <w:r>
-        <w:t xml:space="preserve"> question that</w:t>
-      </w:r>
-      <w:r>
-        <w:t>,</w:t>
-      </w:r>
-      <w:r>
-        <w:t xml:space="preserve"> when he worked on armed robberies, he used to ask a lot more.</w:t>
-      </w:r>
-      <w:r>
-        <w:t xml:space="preserve"> And given that he was </w:t>
-      </w:r>
-      <w:proofErr w:type="gramStart"/>
-      <w:r>
-        <w:t>absolutely certain</w:t>
-      </w:r>
-      <w:proofErr w:type="gramEnd"/>
-      <w:r>
-        <w:t xml:space="preserve"> that Johnson was innocent, of any crime – other than </w:t>
-      </w:r>
-      <w:proofErr w:type="gramStart"/>
-      <w:r>
-        <w:t>actually believing</w:t>
-      </w:r>
-      <w:proofErr w:type="gramEnd"/>
-      <w:r>
-        <w:t xml:space="preserve"> that the world was going end because the year had a certain number of zeros on the end of it – seemed a bit abrupt.</w:t>
-      </w:r>
-    </w:p>
-    <w:p>
-      <w:r>
-        <w:t>“What did you do with the money?”</w:t>
-      </w:r>
-    </w:p>
-    <w:p>
-      <w:r>
-        <w:t>“Well, I know this is a bit of a cliché, but we sent, well we still do, we sen</w:t>
-      </w:r>
-      <w:r>
-        <w:t>t</w:t>
-      </w:r>
-      <w:r>
-        <w:t xml:space="preserve"> it to Africa</w:t>
-      </w:r>
-      <w:r>
-        <w:t>, we raise money now you see</w:t>
-      </w:r>
-      <w:r>
-        <w:t>. My church frowns on missionary work. But it encourages schooling, education, free thought! So, we use it to support several schools. As a matter of fact, my son is there working at one right now.”</w:t>
-      </w:r>
-    </w:p>
-    <w:p>
-      <w:r>
-        <w:t>“Do you still do business with Mr</w:t>
-      </w:r>
-      <w:r>
-        <w:t>.</w:t>
-      </w:r>
-      <w:r>
-        <w:t xml:space="preserve"> Grafton.”</w:t>
-      </w:r>
-    </w:p>
-    <w:p>
-      <w:r>
-        <w:t>“Well, actually, no.”</w:t>
-      </w:r>
-    </w:p>
-    <w:p>
-      <w:r>
-        <w:t>“No?”</w:t>
-      </w:r>
-      <w:r>
-        <w:br/>
-        <w:t>“No.”</w:t>
-      </w:r>
-    </w:p>
-    <w:p>
-      <w:r>
         <w:t>There was a pause.</w:t>
       </w:r>
     </w:p>

</xml_diff>